<commit_message>
Record decision: date-average PERMANOVA is the main whole-profile test
Co-Authored-By: Claude Opus 5.5 <noreply@anthropic.com>
</commit_message>
<xml_diff>
--- a/Docs/Analysis_notes_v4.docx
+++ b/Docs/Analysis_notes_v4.docx
@@ -1085,6 +1085,34 @@
                 <w:sz w:val="18"/>
               </w:rPr>
               <w:t xml:space="preserve">H1a reported as two separate results, level and mix; NMDS drawn without connecting lines; Q3 includes a leave-one-date-out check.</w:t>
+            </w:r>
+          </w:p>
+        </w:tc>
+      </w:tr>
+      <w:tr>
+        <w:tc>
+          <w:tcPr>
+            <w:tcW w:w="1560" w:type="dxa"/>
+          </w:tcPr>
+          <w:p>
+            <w:r>
+              <w:rPr>
+                <w:sz w:val="18"/>
+              </w:rPr>
+              <w:t xml:space="preserve">D13 (2026-10-25)</w:t>
+            </w:r>
+          </w:p>
+        </w:tc>
+        <w:tc>
+          <w:tcPr>
+            <w:tcW w:w="7800" w:type="dxa"/>
+          </w:tcPr>
+          <w:p>
+            <w:r>
+              <w:rPr>
+                <w:sz w:val="18"/>
+              </w:rPr>
+              <w:t xml:space="preserve">Date-average PERMANOVA is the main whole-profile test; the all-samples version with whole dates shuffled is the check.</w:t>
             </w:r>
           </w:p>
         </w:tc>

</xml_diff>